<commit_message>
feat(philsms): adapt manual to live gateway testing walkthrough and enhance PhilSMS recipient handling
</commit_message>
<xml_diff>
--- a/docs/09-09-2026_TapNQue_Comprehensive_System_Guide_and_SMS_Manual.docx
+++ b/docs/09-09-2026_TapNQue_Comprehensive_System_Guide_and_SMS_Manual.docx
@@ -3,6 +3,18 @@
 <w:document xmlns:w="http://schemas.openxmlformats.org/wordprocessingml/2006/main" xmlns:m="http://schemas.openxmlformats.org/officeDocument/2006/math" xmlns:r="http://schemas.openxmlformats.org/officeDocument/2006/relationships" xmlns:o="urn:schemas-microsoft-com:office:office" xmlns:v="urn:schemas-microsoft-com:vml" xmlns:w10="urn:schemas-microsoft-com:office:word" xmlns:a="http://schemas.openxmlformats.org/drawingml/2006/main" xmlns:pic="http://schemas.openxmlformats.org/drawingml/2006/picture" xmlns:wp="http://schemas.openxmlformats.org/drawingml/2006/wordprocessingDrawing">
   <w:body>
     <w:bookmarkStart w:id="34" w:name="tapnque-queue-management-system"/>
+    <w:p>
+      <w:r>
+        <w:rPr>
+          <w:rFonts w:ascii="Times New Roman" w:hAnsi="Times New Roman"/>
+          <w:b/>
+          <w:color w:val="000000"/>
+          <w:sz w:val="22"/>
+        </w:rPr>
+        <w:t>SUPERSEDED (11-09-2026): The SMS gateway client described in this document targeted Semaphore. The system has migrated to PhilSMS (REST API v3, JSON + Bearer token). For the current implementation, see 11-09-2026_SEMAPHORE_TO_PHILSMS_MIGRATION.md and 11-09-2026_TapNQue_Comprehensive_System_Guide_and_PhilSMS_Manual.md/.docx. Semaphore-specific statements below are retained as historical record only.</w:t>
+      </w:r>
+    </w:p>
+    <w:p/>
     <w:p>
       <w:pPr>
         <w:pStyle w:val="Heading1"/>

</xml_diff>